<commit_message>
Ajusta el documento del segundo avance a la plantilla del trabajo final
Co-Authored-By: Claude Opus 5.5 <noreply@anthropic.com>
Claude-Session: https://claude.ai/code/session_01JxubsWg8BJzfu4KLza3j7V
</commit_message>
<xml_diff>
--- a/docs/TimeBank_Trabajo_Final_Avance2.docx
+++ b/docs/TimeBank_Trabajo_Final_Avance2.docx
@@ -4,242 +4,322 @@
   <w:body>
     <w:p>
       <w:pPr>
-        <w:spacing w:before="0" w:after="600" w:line="276" w:lineRule="auto"/>
-        <w:jc w:val="both"/>
-      </w:pPr>
-    </w:p>
-    <w:p>
-      <w:pPr>
-        <w:spacing w:before="0" w:after="120" w:line="276" w:lineRule="auto"/>
-        <w:jc w:val="center"/>
-      </w:pPr>
-      <w:r>
-        <w:rPr>
-          <w:rFonts w:ascii="Arial" w:hAnsi="Arial" w:cs="Arial"/>
-          <w:b/>
-          <w:bCs/>
-          <w:sz w:val="32"/>
-          <w:szCs w:val="32"/>
-          <w:lang w:val="es-EC"/>
-        </w:rPr>
-        <w:t xml:space="preserve">INSTITUTO SUPERIOR TECNOLÓGICO QUITO</w:t>
-      </w:r>
-    </w:p>
-    <w:p>
-      <w:pPr>
-        <w:spacing w:before="0" w:after="80" w:line="276" w:lineRule="auto"/>
-        <w:jc w:val="center"/>
-      </w:pPr>
-      <w:r>
-        <w:rPr>
-          <w:rFonts w:ascii="Arial" w:hAnsi="Arial" w:cs="Arial"/>
-          <w:sz w:val="26"/>
-          <w:szCs w:val="26"/>
-          <w:lang w:val="es-EC"/>
-        </w:rPr>
-        <w:t xml:space="preserve">Carrera de Desarrollo de Software</w:t>
-      </w:r>
-    </w:p>
-    <w:p>
-      <w:pPr>
-        <w:spacing w:before="0" w:after="900" w:line="276" w:lineRule="auto"/>
-        <w:jc w:val="center"/>
-      </w:pPr>
-      <w:r>
-        <w:rPr>
-          <w:rFonts w:ascii="Arial" w:hAnsi="Arial" w:cs="Arial"/>
-          <w:sz w:val="26"/>
-          <w:szCs w:val="26"/>
-          <w:lang w:val="es-EC"/>
-        </w:rPr>
-        <w:t xml:space="preserve">Asignatura: Ambientes Computacionales</w:t>
-      </w:r>
-    </w:p>
-    <w:p>
-      <w:pPr>
-        <w:spacing w:before="0" w:after="200" w:line="276" w:lineRule="auto"/>
-        <w:jc w:val="center"/>
-      </w:pPr>
-      <w:r>
-        <w:rPr>
-          <w:rFonts w:ascii="Arial" w:hAnsi="Arial" w:cs="Arial"/>
-          <w:b/>
-          <w:bCs/>
-          <w:color w:val="E6333E"/>
-          <w:sz w:val="26"/>
-          <w:szCs w:val="26"/>
-          <w:lang w:val="es-EC"/>
-        </w:rPr>
-        <w:t xml:space="preserve">TRABAJO FINAL DE ASIGNATURA</w:t>
-      </w:r>
-    </w:p>
-    <w:p>
-      <w:pPr>
-        <w:spacing w:before="0" w:after="120" w:line="276" w:lineRule="auto"/>
-        <w:jc w:val="center"/>
-      </w:pPr>
-      <w:r>
-        <w:rPr>
-          <w:rFonts w:ascii="Arial" w:hAnsi="Arial" w:cs="Arial"/>
-          <w:b/>
-          <w:bCs/>
+        <w:spacing w:line="276" w:lineRule="auto"/>
+        <w:rPr>
           <w:sz w:val="56"/>
           <w:szCs w:val="56"/>
           <w:lang w:val="es-EC"/>
         </w:rPr>
-        <w:t xml:space="preserve">TIMEBANK</w:t>
-      </w:r>
-    </w:p>
-    <w:p>
-      <w:pPr>
-        <w:spacing w:before="0" w:after="200" w:line="276" w:lineRule="auto"/>
+      </w:pPr>
+    </w:p>
+    <w:p>
+      <w:pPr>
+        <w:spacing w:line="276" w:lineRule="auto"/>
+        <w:rPr>
+          <w:sz w:val="56"/>
+          <w:szCs w:val="56"/>
+          <w:lang w:val="es-EC"/>
+        </w:rPr>
+      </w:pPr>
+    </w:p>
+    <w:p>
+      <w:pPr>
+        <w:spacing w:line="276" w:lineRule="auto"/>
+        <w:rPr>
+          <w:sz w:val="56"/>
+          <w:szCs w:val="56"/>
+          <w:lang w:val="es-EC"/>
+        </w:rPr>
+      </w:pPr>
+    </w:p>
+    <w:p>
+      <w:pPr>
+        <w:spacing w:line="276" w:lineRule="auto"/>
+        <w:rPr>
+          <w:sz w:val="56"/>
+          <w:szCs w:val="56"/>
+          <w:lang w:val="es-EC"/>
+        </w:rPr>
+      </w:pPr>
+    </w:p>
+    <w:p>
+      <w:pPr>
+        <w:spacing w:line="276" w:lineRule="auto"/>
         <w:jc w:val="center"/>
-      </w:pPr>
-      <w:r>
-        <w:rPr>
-          <w:rFonts w:ascii="Arial" w:hAnsi="Arial" w:cs="Arial"/>
-          <w:sz w:val="28"/>
-          <w:szCs w:val="28"/>
-          <w:lang w:val="es-EC"/>
-        </w:rPr>
-        <w:t xml:space="preserve">Aplicación web de banco de tiempo para el intercambio de servicios por horas</w:t>
-      </w:r>
-    </w:p>
-    <w:p>
-      <w:pPr>
-        <w:spacing w:before="0" w:after="1100" w:line="276" w:lineRule="auto"/>
+        <w:rPr>
+          <w:color w:val="7F7F7F" w:themeColor="text1" w:themeTint="80"/>
+          <w:sz w:val="56"/>
+          <w:szCs w:val="56"/>
+          <w:lang w:val="es-EC"/>
+        </w:rPr>
+      </w:pPr>
+      <w:r>
+        <w:rPr>
+          <w:color w:val="7F7F7F" w:themeColor="text1" w:themeTint="80"/>
+          <w:sz w:val="56"/>
+          <w:szCs w:val="56"/>
+          <w:lang w:val="es-EC"/>
+        </w:rPr>
+        <w:t>PORTADA DE LA CARRERA</w:t>
+      </w:r>
+    </w:p>
+    <w:p>
+      <w:pPr>
+        <w:spacing w:line="276" w:lineRule="auto"/>
         <w:jc w:val="center"/>
-      </w:pPr>
-      <w:r>
-        <w:rPr>
-          <w:rFonts w:ascii="Arial" w:hAnsi="Arial" w:cs="Arial"/>
-          <w:b/>
-          <w:bCs/>
-          <w:sz w:val="26"/>
-          <w:szCs w:val="26"/>
-          <w:lang w:val="es-EC"/>
-        </w:rPr>
-        <w:t xml:space="preserve">Segundo avance</w:t>
-      </w:r>
-    </w:p>
-    <w:p>
-      <w:pPr>
-        <w:spacing w:before="0" w:after="60" w:line="276" w:lineRule="auto"/>
-        <w:jc w:val="center"/>
-      </w:pPr>
-      <w:r>
-        <w:rPr>
-          <w:rFonts w:ascii="Arial" w:hAnsi="Arial" w:cs="Arial"/>
-          <w:b/>
-          <w:bCs/>
-          <w:sz w:val="24"/>
-          <w:szCs w:val="24"/>
-          <w:lang w:val="es-EC"/>
-        </w:rPr>
-        <w:t xml:space="preserve">Integrantes:</w:t>
-      </w:r>
-    </w:p>
-    <w:p>
-      <w:pPr>
-        <w:spacing w:before="0" w:after="40" w:line="276" w:lineRule="auto"/>
-        <w:jc w:val="center"/>
-      </w:pPr>
-      <w:r>
-        <w:rPr>
-          <w:rFonts w:ascii="Arial" w:hAnsi="Arial" w:cs="Arial"/>
-          <w:sz w:val="24"/>
-          <w:szCs w:val="24"/>
-          <w:lang w:val="es-EC"/>
-        </w:rPr>
-        <w:t xml:space="preserve">Kevin Adrián Quiñonez Rocha</w:t>
-      </w:r>
-    </w:p>
-    <w:p>
-      <w:pPr>
-        <w:spacing w:before="0" w:after="300" w:line="276" w:lineRule="auto"/>
-        <w:jc w:val="center"/>
-      </w:pPr>
-      <w:r>
-        <w:rPr>
-          <w:rFonts w:ascii="Arial" w:hAnsi="Arial" w:cs="Arial"/>
-          <w:sz w:val="24"/>
-          <w:szCs w:val="24"/>
-          <w:lang w:val="es-EC"/>
-        </w:rPr>
-        <w:t xml:space="preserve">Orlando Eloy Trujillo</w:t>
-      </w:r>
-    </w:p>
-    <w:p>
-      <w:pPr>
-        <w:spacing w:before="0" w:after="60" w:line="276" w:lineRule="auto"/>
-        <w:jc w:val="center"/>
-      </w:pPr>
-      <w:r>
-        <w:rPr>
-          <w:rFonts w:ascii="Arial" w:hAnsi="Arial" w:cs="Arial"/>
-          <w:b/>
-          <w:bCs/>
-          <w:sz w:val="24"/>
-          <w:szCs w:val="24"/>
-          <w:lang w:val="es-EC"/>
-        </w:rPr>
-        <w:t xml:space="preserve">Docente: </w:t>
-      </w:r>
-      <w:r>
-        <w:rPr>
-          <w:rFonts w:ascii="Arial" w:hAnsi="Arial" w:cs="Arial"/>
-          <w:sz w:val="24"/>
-          <w:szCs w:val="24"/>
-          <w:lang w:val="es-EC"/>
-        </w:rPr>
-        <w:t xml:space="preserve">Ing. Eldis Gabriel Nicolalde Navarrete</w:t>
-      </w:r>
-    </w:p>
-    <w:p>
-      <w:pPr>
-        <w:spacing w:before="0" w:after="900" w:line="276" w:lineRule="auto"/>
-        <w:jc w:val="center"/>
-      </w:pPr>
-      <w:r>
-        <w:rPr>
-          <w:rFonts w:ascii="Arial" w:hAnsi="Arial" w:cs="Arial"/>
-          <w:b/>
-          <w:bCs/>
-          <w:sz w:val="24"/>
-          <w:szCs w:val="24"/>
-          <w:lang w:val="es-EC"/>
-        </w:rPr>
-        <w:t xml:space="preserve">Nivel: </w:t>
-      </w:r>
-      <w:r>
-        <w:rPr>
-          <w:rFonts w:ascii="Arial" w:hAnsi="Arial" w:cs="Arial"/>
-          <w:sz w:val="24"/>
-          <w:szCs w:val="24"/>
-          <w:lang w:val="es-EC"/>
-        </w:rPr>
-        <w:t xml:space="preserve">Cuarto</w:t>
-      </w:r>
-    </w:p>
-    <w:p>
-      <w:pPr>
-        <w:spacing w:before="0" w:after="0" w:line="276" w:lineRule="auto"/>
-        <w:jc w:val="center"/>
-      </w:pPr>
-      <w:r>
-        <w:rPr>
-          <w:rFonts w:ascii="Arial" w:hAnsi="Arial" w:cs="Arial"/>
-          <w:sz w:val="24"/>
-          <w:szCs w:val="24"/>
-          <w:lang w:val="es-EC"/>
-        </w:rPr>
-        <w:t xml:space="preserve">Quito, octubre de 2026</w:t>
-      </w:r>
-    </w:p>
-    <w:p>
-      <w:r>
-        <w:br w:type="page"/>
-      </w:r>
+        <w:rPr>
+          <w:color w:val="7F7F7F" w:themeColor="text1" w:themeTint="80"/>
+          <w:lang w:val="es-EC"/>
+        </w:rPr>
+      </w:pPr>
+      <w:r>
+        <w:rPr>
+          <w:color w:val="7F7F7F" w:themeColor="text1" w:themeTint="80"/>
+          <w:lang w:val="es-EC"/>
+        </w:rPr>
+        <w:t>(descargar del apartado IV Proyecto Final de la plataforma EVA según corresponda)</w:t>
+      </w:r>
+    </w:p>
+    <w:p>
+      <w:pPr>
+        <w:spacing w:line="276" w:lineRule="auto"/>
+        <w:rPr>
+          <w:color w:val="7F7F7F" w:themeColor="text1" w:themeTint="80"/>
+          <w:lang w:val="es-EC"/>
+        </w:rPr>
+      </w:pPr>
+    </w:p>
+    <w:p>
+      <w:pPr>
+        <w:spacing w:line="276" w:lineRule="auto"/>
+        <w:rPr>
+          <w:lang w:val="es-EC"/>
+        </w:rPr>
+      </w:pPr>
+    </w:p>
+    <w:p>
+      <w:pPr>
+        <w:spacing w:line="276" w:lineRule="auto"/>
+        <w:rPr>
+          <w:lang w:val="es-EC"/>
+        </w:rPr>
+      </w:pPr>
+    </w:p>
+    <w:p>
+      <w:pPr>
+        <w:spacing w:line="276" w:lineRule="auto"/>
+        <w:rPr>
+          <w:lang w:val="es-EC"/>
+        </w:rPr>
+      </w:pPr>
+    </w:p>
+    <w:p>
+      <w:pPr>
+        <w:spacing w:line="276" w:lineRule="auto"/>
+        <w:rPr>
+          <w:lang w:val="es-EC"/>
+        </w:rPr>
+      </w:pPr>
+    </w:p>
+    <w:p>
+      <w:pPr>
+        <w:spacing w:line="276" w:lineRule="auto"/>
+        <w:rPr>
+          <w:lang w:val="es-EC"/>
+        </w:rPr>
+      </w:pPr>
+    </w:p>
+    <w:p>
+      <w:pPr>
+        <w:spacing w:line="276" w:lineRule="auto"/>
+        <w:rPr>
+          <w:lang w:val="es-EC"/>
+        </w:rPr>
+      </w:pPr>
+    </w:p>
+    <w:p>
+      <w:pPr>
+        <w:spacing w:line="276" w:lineRule="auto"/>
+        <w:rPr>
+          <w:lang w:val="es-EC"/>
+        </w:rPr>
+      </w:pPr>
+    </w:p>
+    <w:p>
+      <w:pPr>
+        <w:spacing w:line="276" w:lineRule="auto"/>
+        <w:rPr>
+          <w:lang w:val="es-EC"/>
+        </w:rPr>
+      </w:pPr>
+    </w:p>
+    <w:p>
+      <w:pPr>
+        <w:spacing w:line="276" w:lineRule="auto"/>
+        <w:rPr>
+          <w:lang w:val="es-EC"/>
+        </w:rPr>
+      </w:pPr>
+    </w:p>
+    <w:p>
+      <w:pPr>
+        <w:spacing w:line="276" w:lineRule="auto"/>
+        <w:rPr>
+          <w:lang w:val="es-EC"/>
+        </w:rPr>
+      </w:pPr>
+    </w:p>
+    <w:p>
+      <w:pPr>
+        <w:spacing w:line="276" w:lineRule="auto"/>
+        <w:rPr>
+          <w:lang w:val="es-EC"/>
+        </w:rPr>
+      </w:pPr>
+    </w:p>
+    <w:p>
+      <w:pPr>
+        <w:spacing w:line="276" w:lineRule="auto"/>
+        <w:rPr>
+          <w:lang w:val="es-EC"/>
+        </w:rPr>
+      </w:pPr>
+    </w:p>
+    <w:p>
+      <w:pPr>
+        <w:spacing w:line="276" w:lineRule="auto"/>
+        <w:rPr>
+          <w:lang w:val="es-EC"/>
+        </w:rPr>
+      </w:pPr>
+    </w:p>
+    <w:p>
+      <w:pPr>
+        <w:spacing w:line="276" w:lineRule="auto"/>
+        <w:rPr>
+          <w:lang w:val="es-EC"/>
+        </w:rPr>
+      </w:pPr>
+    </w:p>
+    <w:p>
+      <w:pPr>
+        <w:spacing w:line="276" w:lineRule="auto"/>
+        <w:rPr>
+          <w:lang w:val="es-EC"/>
+        </w:rPr>
+      </w:pPr>
+    </w:p>
+    <w:p>
+      <w:pPr>
+        <w:spacing w:line="276" w:lineRule="auto"/>
+        <w:rPr>
+          <w:lang w:val="es-EC"/>
+        </w:rPr>
+      </w:pPr>
+    </w:p>
+    <w:p>
+      <w:pPr>
+        <w:spacing w:line="276" w:lineRule="auto"/>
+        <w:rPr>
+          <w:lang w:val="es-EC"/>
+        </w:rPr>
+      </w:pPr>
+    </w:p>
+    <w:p>
+      <w:pPr>
+        <w:spacing w:line="276" w:lineRule="auto"/>
+        <w:rPr>
+          <w:lang w:val="es-EC"/>
+        </w:rPr>
+      </w:pPr>
+    </w:p>
+    <w:p>
+      <w:pPr>
+        <w:spacing w:line="276" w:lineRule="auto"/>
+        <w:rPr>
+          <w:lang w:val="es-EC"/>
+        </w:rPr>
+      </w:pPr>
+    </w:p>
+    <w:p>
+      <w:pPr>
+        <w:spacing w:line="276" w:lineRule="auto"/>
+        <w:rPr>
+          <w:lang w:val="es-EC"/>
+        </w:rPr>
+      </w:pPr>
+    </w:p>
+    <w:p>
+      <w:pPr>
+        <w:spacing w:line="276" w:lineRule="auto"/>
+        <w:rPr>
+          <w:lang w:val="es-EC"/>
+        </w:rPr>
+      </w:pPr>
+    </w:p>
+    <w:p>
+      <w:pPr>
+        <w:spacing w:line="276" w:lineRule="auto"/>
+        <w:rPr>
+          <w:lang w:val="es-EC"/>
+        </w:rPr>
+      </w:pPr>
+    </w:p>
+    <w:p>
+      <w:pPr>
+        <w:spacing w:line="276" w:lineRule="auto"/>
+        <w:rPr>
+          <w:lang w:val="es-EC"/>
+        </w:rPr>
+      </w:pPr>
+    </w:p>
+    <w:p>
+      <w:pPr>
+        <w:spacing w:line="276" w:lineRule="auto"/>
+        <w:rPr>
+          <w:lang w:val="es-EC"/>
+        </w:rPr>
+      </w:pPr>
+    </w:p>
+    <w:p>
+      <w:pPr>
+        <w:spacing w:line="276" w:lineRule="auto"/>
+        <w:rPr>
+          <w:lang w:val="es-EC"/>
+        </w:rPr>
+      </w:pPr>
+    </w:p>
+    <w:p>
+      <w:pPr>
+        <w:spacing w:line="276" w:lineRule="auto"/>
+        <w:rPr>
+          <w:lang w:val="es-EC"/>
+        </w:rPr>
+      </w:pPr>
+    </w:p>
+    <w:p>
+      <w:pPr>
+        <w:spacing w:line="276" w:lineRule="auto"/>
+        <w:rPr>
+          <w:lang w:val="es-EC"/>
+        </w:rPr>
+      </w:pPr>
+    </w:p>
+    <w:p>
+      <w:pPr>
+        <w:spacing w:line="276" w:lineRule="auto"/>
+        <w:rPr>
+          <w:lang w:val="es-EC"/>
+        </w:rPr>
+      </w:pPr>
+    </w:p>
+    <w:p>
+      <w:pPr>
+        <w:spacing w:line="276" w:lineRule="auto"/>
+        <w:rPr>
+          <w:lang w:val="es-EC"/>
+        </w:rPr>
+      </w:pPr>
     </w:p>
     <w:tbl>
       <w:tblPr>
@@ -632,16 +712,27 @@
     </w:tbl>
     <w:p>
       <w:pPr>
-        <w:spacing w:before="200" w:after="60" w:line="276" w:lineRule="auto"/>
         <w:jc w:val="center"/>
-      </w:pPr>
-      <w:r>
+        <w:rPr>
+          <w:rFonts w:cs="Calibri"/>
+          <w:sz w:val="32"/>
+          <w:lang w:val="es-EC"/>
+        </w:rPr>
+      </w:pPr>
+    </w:p>
+    <w:p>
+      <w:pPr>
+        <w:jc w:val="center"/>
         <w:rPr>
           <w:rFonts w:cs="Calibri"/>
           <w:b/>
-          <w:bCs/>
-          <w:sz w:val="24"/>
-          <w:szCs w:val="24"/>
+          <w:lang w:val="es-EC"/>
+        </w:rPr>
+      </w:pPr>
+      <w:r>
+        <w:rPr>
+          <w:rFonts w:cs="Calibri"/>
+          <w:b/>
           <w:lang w:val="es-EC"/>
         </w:rPr>
         <w:t xml:space="preserve">TRABAJO FINAL DE ASIGNATURA</w:t>
@@ -649,8 +740,14 @@
     </w:p>
     <w:p>
       <w:pPr>
-        <w:spacing w:before="0" w:after="60" w:line="276" w:lineRule="auto"/>
         <w:jc w:val="center"/>
+        <w:rPr>
+          <w:rFonts w:cs="Calibri"/>
+          <w:b/>
+          <w:sz w:val="28"/>
+          <w:szCs w:val="28"/>
+          <w:lang w:val="es-EC"/>
+        </w:rPr>
       </w:pPr>
       <w:r>
         <w:rPr>
@@ -666,33 +763,31 @@
     </w:p>
     <w:p>
       <w:pPr>
-        <w:spacing w:before="0" w:after="240" w:line="276" w:lineRule="auto"/>
         <w:jc w:val="center"/>
-      </w:pPr>
-      <w:r>
-        <w:rPr>
-          <w:rFonts w:ascii="Arial" w:hAnsi="Arial" w:cs="Arial"/>
-          <w:i/>
-          <w:iCs/>
-          <w:color w:val="595959"/>
-          <w:sz w:val="22"/>
-          <w:szCs w:val="22"/>
-          <w:lang w:val="es-EC"/>
-        </w:rPr>
-        <w:t xml:space="preserve">Segundo avance · corte al 7 de octubre de 2026</w:t>
-      </w:r>
+        <w:rPr>
+          <w:rFonts w:cs="Calibri"/>
+          <w:b/>
+          <w:sz w:val="28"/>
+          <w:szCs w:val="28"/>
+          <w:lang w:val="es-EC"/>
+        </w:rPr>
+      </w:pPr>
     </w:p>
     <w:p>
       <w:pPr>
         <w:pStyle w:val="Prrafodelista"/>
-        <w:keepNext/>
         <w:numPr>
           <w:ilvl w:val="0"/>
           <w:numId w:val="10"/>
         </w:numPr>
-        <w:spacing w:before="280" w:after="140" w:line="276" w:lineRule="auto"/>
-        <w:ind w:left="360" w:hanging="360"/>
-        <w:jc w:val="left"/>
+        <w:jc w:val="both"/>
+        <w:rPr>
+          <w:rFonts w:ascii="Arial" w:hAnsi="Arial" w:cs="Arial"/>
+          <w:bCs/>
+          <w:sz w:val="24"/>
+          <w:szCs w:val="24"/>
+          <w:lang w:val="es-EC"/>
+        </w:rPr>
       </w:pPr>
       <w:r>
         <w:rPr>
@@ -701,9 +796,8 @@
           <w:bCs/>
           <w:sz w:val="24"/>
           <w:szCs w:val="24"/>
-          <w:lang w:val="es-EC"/>
-        </w:rPr>
-        <w:t xml:space="preserve">Descripción del trabajo final</w:t>
+        </w:rPr>
+        <w:t xml:space="preserve">Descripción del trabajo final </w:t>
       </w:r>
     </w:p>
     <w:p>
@@ -764,26 +858,37 @@
     </w:p>
     <w:p>
       <w:pPr>
-        <w:pStyle w:val="Prrafodelista"/>
-        <w:keepNext/>
+        <w:spacing w:after="0"/>
+      </w:pPr>
+    </w:p>
+    <w:p>
+      <w:pPr>
+        <w:pStyle w:val="Ttulo2"/>
         <w:numPr>
           <w:ilvl w:val="0"/>
           <w:numId w:val="10"/>
         </w:numPr>
-        <w:spacing w:before="280" w:after="140" w:line="276" w:lineRule="auto"/>
-        <w:ind w:left="360" w:hanging="360"/>
-        <w:jc w:val="left"/>
-      </w:pPr>
-      <w:r>
         <w:rPr>
           <w:rFonts w:ascii="Arial" w:hAnsi="Arial" w:cs="Arial"/>
           <w:b/>
           <w:bCs/>
-          <w:sz w:val="24"/>
-          <w:szCs w:val="24"/>
-          <w:lang w:val="es-EC"/>
-        </w:rPr>
-        <w:t xml:space="preserve">Objetivo General</w:t>
+          <w:color w:val="auto"/>
+          <w:sz w:val="24"/>
+          <w:szCs w:val="24"/>
+          <w:lang w:val="es-EC"/>
+        </w:rPr>
+      </w:pPr>
+      <w:r>
+        <w:rPr>
+          <w:rFonts w:ascii="Arial" w:hAnsi="Arial" w:cs="Arial"/>
+          <w:b/>
+          <w:bCs/>
+          <w:color w:val="auto"/>
+          <w:sz w:val="24"/>
+          <w:szCs w:val="24"/>
+          <w:lang w:val="es-EC"/>
+        </w:rPr>
+        <w:t xml:space="preserve">Objetivo General  </w:t>
       </w:r>
     </w:p>
     <w:p>
@@ -803,26 +908,37 @@
     </w:p>
     <w:p>
       <w:pPr>
-        <w:pStyle w:val="Prrafodelista"/>
-        <w:keepNext/>
+        <w:spacing w:after="0"/>
+      </w:pPr>
+    </w:p>
+    <w:p>
+      <w:pPr>
+        <w:pStyle w:val="Ttulo2"/>
         <w:numPr>
           <w:ilvl w:val="0"/>
           <w:numId w:val="10"/>
         </w:numPr>
-        <w:spacing w:before="280" w:after="140" w:line="276" w:lineRule="auto"/>
-        <w:ind w:left="360" w:hanging="360"/>
-        <w:jc w:val="left"/>
-      </w:pPr>
-      <w:r>
         <w:rPr>
           <w:rFonts w:ascii="Arial" w:hAnsi="Arial" w:cs="Arial"/>
           <w:b/>
           <w:bCs/>
-          <w:sz w:val="24"/>
-          <w:szCs w:val="24"/>
-          <w:lang w:val="es-EC"/>
-        </w:rPr>
-        <w:t xml:space="preserve">Objetivos Específicos</w:t>
+          <w:color w:val="auto"/>
+          <w:sz w:val="24"/>
+          <w:szCs w:val="24"/>
+          <w:lang w:val="es-EC"/>
+        </w:rPr>
+      </w:pPr>
+      <w:r>
+        <w:rPr>
+          <w:rFonts w:ascii="Arial" w:hAnsi="Arial" w:cs="Arial"/>
+          <w:b/>
+          <w:bCs/>
+          <w:color w:val="auto"/>
+          <w:sz w:val="24"/>
+          <w:szCs w:val="24"/>
+          <w:lang w:val="es-EC"/>
+        </w:rPr>
+        <w:t xml:space="preserve">Objetivos Específicos  </w:t>
       </w:r>
     </w:p>
     <w:p>
@@ -890,26 +1006,37 @@
     </w:p>
     <w:p>
       <w:pPr>
-        <w:pStyle w:val="Prrafodelista"/>
-        <w:keepNext/>
+        <w:spacing w:after="0"/>
+      </w:pPr>
+    </w:p>
+    <w:p>
+      <w:pPr>
+        <w:pStyle w:val="Ttulo2"/>
         <w:numPr>
           <w:ilvl w:val="0"/>
           <w:numId w:val="10"/>
         </w:numPr>
-        <w:spacing w:before="280" w:after="140" w:line="276" w:lineRule="auto"/>
-        <w:ind w:left="360" w:hanging="360"/>
-        <w:jc w:val="left"/>
-      </w:pPr>
-      <w:r>
         <w:rPr>
           <w:rFonts w:ascii="Arial" w:hAnsi="Arial" w:cs="Arial"/>
           <w:b/>
           <w:bCs/>
-          <w:sz w:val="24"/>
-          <w:szCs w:val="24"/>
-          <w:lang w:val="es-EC"/>
-        </w:rPr>
-        <w:t xml:space="preserve">Resultado de Aprendizaje</w:t>
+          <w:color w:val="auto"/>
+          <w:sz w:val="24"/>
+          <w:szCs w:val="24"/>
+          <w:lang w:val="es-EC"/>
+        </w:rPr>
+      </w:pPr>
+      <w:r>
+        <w:rPr>
+          <w:rFonts w:ascii="Arial" w:hAnsi="Arial" w:cs="Arial"/>
+          <w:b/>
+          <w:bCs/>
+          <w:color w:val="auto"/>
+          <w:sz w:val="24"/>
+          <w:szCs w:val="24"/>
+          <w:lang w:val="es-EC"/>
+        </w:rPr>
+        <w:t>Resultado de Aprendizaje</w:t>
       </w:r>
     </w:p>
     <w:p>
@@ -932,988 +1059,35 @@
     </w:p>
     <w:p>
       <w:pPr>
-        <w:pStyle w:val="Prrafodelista"/>
-        <w:keepNext/>
+        <w:spacing w:after="0"/>
+      </w:pPr>
+    </w:p>
+    <w:p>
+      <w:pPr>
+        <w:pStyle w:val="Ttulo1"/>
         <w:numPr>
           <w:ilvl w:val="0"/>
           <w:numId w:val="10"/>
         </w:numPr>
-        <w:spacing w:before="280" w:after="140" w:line="276" w:lineRule="auto"/>
-        <w:ind w:left="360" w:hanging="360"/>
-        <w:jc w:val="left"/>
-      </w:pPr>
-      <w:r>
         <w:rPr>
           <w:rFonts w:ascii="Arial" w:hAnsi="Arial" w:cs="Arial"/>
           <w:b/>
           <w:bCs/>
-          <w:sz w:val="24"/>
-          <w:szCs w:val="24"/>
-          <w:lang w:val="es-EC"/>
-        </w:rPr>
-        <w:t xml:space="preserve">Recursos necesarios</w:t>
-      </w:r>
-    </w:p>
-    <w:p>
-      <w:pPr>
-        <w:keepNext/>
-        <w:spacing w:before="120" w:after="80" w:line="276" w:lineRule="auto"/>
-        <w:jc w:val="left"/>
+          <w:color w:val="auto"/>
+          <w:sz w:val="24"/>
+          <w:szCs w:val="24"/>
+        </w:rPr>
       </w:pPr>
       <w:r>
         <w:rPr>
           <w:rFonts w:ascii="Arial" w:hAnsi="Arial" w:cs="Arial"/>
           <w:b/>
           <w:bCs/>
-          <w:sz w:val="20"/>
-          <w:szCs w:val="20"/>
-          <w:lang w:val="es-EC"/>
-        </w:rPr>
-        <w:t xml:space="preserve">Tabla 1. </w:t>
-      </w:r>
-      <w:r>
-        <w:rPr>
-          <w:rFonts w:ascii="Arial" w:hAnsi="Arial" w:cs="Arial"/>
-          <w:i/>
-          <w:iCs/>
-          <w:sz w:val="20"/>
-          <w:szCs w:val="20"/>
-          <w:lang w:val="es-EC"/>
-        </w:rPr>
-        <w:t xml:space="preserve">Recursos utilizados en el proyecto.</w:t>
-      </w:r>
-    </w:p>
-    <w:tbl>
-      <w:tblPr>
-        <w:tblW w:w="8498" w:type="dxa"/>
-        <w:tblBorders>
-          <w:top w:val="single" w:sz="4" w:space="0" w:color="A6A6A6"/>
-          <w:left w:val="single" w:sz="4" w:space="0" w:color="A6A6A6"/>
-          <w:bottom w:val="single" w:sz="4" w:space="0" w:color="A6A6A6"/>
-          <w:right w:val="single" w:sz="4" w:space="0" w:color="A6A6A6"/>
-          <w:insideH w:val="single" w:sz="4" w:space="0" w:color="A6A6A6"/>
-          <w:insideV w:val="single" w:sz="4" w:space="0" w:color="A6A6A6"/>
-        </w:tblBorders>
-        <w:tblLayout w:type="fixed"/>
-        <w:tblCellMar>
-          <w:top w:w="60" w:type="dxa"/>
-          <w:left w:w="100" w:type="dxa"/>
-          <w:bottom w:w="60" w:type="dxa"/>
-          <w:right w:w="100" w:type="dxa"/>
-        </w:tblCellMar>
-        <w:tblLook w:val="04A0" w:firstRow="1" w:lastRow="0" w:firstColumn="0" w:lastColumn="0" w:noHBand="0" w:noVBand="1"/>
-      </w:tblPr>
-      <w:tblGrid>
-        <w:gridCol w:w="1300"/>
-        <w:gridCol w:w="3700"/>
-        <w:gridCol w:w="3498"/>
-      </w:tblGrid>
-      <w:tr>
-        <w:trPr>
-          <w:tblHeader/>
-          <w:cantSplit/>
-        </w:trPr>
-        <w:tc>
-          <w:tcPr>
-            <w:tcW w:w="1300" w:type="dxa"/>
-            <w:shd w:val="clear" w:color="auto" w:fill="1B2333"/>
-            <w:vAlign w:val="center"/>
-          </w:tcPr>
-          <w:p>
-            <w:pPr>
-              <w:spacing w:before="0" w:after="0" w:line="240" w:lineRule="auto"/>
-              <w:jc w:val="left"/>
-            </w:pPr>
-            <w:r>
-              <w:rPr>
-                <w:rFonts w:ascii="Arial" w:hAnsi="Arial" w:cs="Arial"/>
-                <w:b/>
-                <w:bCs/>
-                <w:color w:val="FFFFFF"/>
-                <w:sz w:val="20"/>
-                <w:szCs w:val="20"/>
-                <w:lang w:val="es-EC"/>
-              </w:rPr>
-              <w:t xml:space="preserve">Tipo</w:t>
-            </w:r>
-          </w:p>
-        </w:tc>
-        <w:tc>
-          <w:tcPr>
-            <w:tcW w:w="3700" w:type="dxa"/>
-            <w:shd w:val="clear" w:color="auto" w:fill="1B2333"/>
-            <w:vAlign w:val="center"/>
-          </w:tcPr>
-          <w:p>
-            <w:pPr>
-              <w:spacing w:before="0" w:after="0" w:line="240" w:lineRule="auto"/>
-              <w:jc w:val="left"/>
-            </w:pPr>
-            <w:r>
-              <w:rPr>
-                <w:rFonts w:ascii="Arial" w:hAnsi="Arial" w:cs="Arial"/>
-                <w:b/>
-                <w:bCs/>
-                <w:color w:val="FFFFFF"/>
-                <w:sz w:val="20"/>
-                <w:szCs w:val="20"/>
-                <w:lang w:val="es-EC"/>
-              </w:rPr>
-              <w:t xml:space="preserve">Recurso</w:t>
-            </w:r>
-          </w:p>
-        </w:tc>
-        <w:tc>
-          <w:tcPr>
-            <w:tcW w:w="3498" w:type="dxa"/>
-            <w:shd w:val="clear" w:color="auto" w:fill="1B2333"/>
-            <w:vAlign w:val="center"/>
-          </w:tcPr>
-          <w:p>
-            <w:pPr>
-              <w:spacing w:before="0" w:after="0" w:line="240" w:lineRule="auto"/>
-              <w:jc w:val="left"/>
-            </w:pPr>
-            <w:r>
-              <w:rPr>
-                <w:rFonts w:ascii="Arial" w:hAnsi="Arial" w:cs="Arial"/>
-                <w:b/>
-                <w:bCs/>
-                <w:color w:val="FFFFFF"/>
-                <w:sz w:val="20"/>
-                <w:szCs w:val="20"/>
-                <w:lang w:val="es-EC"/>
-              </w:rPr>
-              <w:t xml:space="preserve">Uso en el proyecto</w:t>
-            </w:r>
-          </w:p>
-        </w:tc>
-      </w:tr>
-      <w:tr>
-        <w:trPr>
-          <w:cantSplit/>
-        </w:trPr>
-        <w:tc>
-          <w:tcPr>
-            <w:tcW w:w="1300" w:type="dxa"/>
-            <w:vAlign w:val="center"/>
-          </w:tcPr>
-          <w:p>
-            <w:pPr>
-              <w:spacing w:before="0" w:after="0" w:line="240" w:lineRule="auto"/>
-              <w:jc w:val="left"/>
-            </w:pPr>
-            <w:r>
-              <w:rPr>
-                <w:rFonts w:ascii="Arial" w:hAnsi="Arial" w:cs="Arial"/>
-                <w:sz w:val="20"/>
-                <w:szCs w:val="20"/>
-                <w:lang w:val="es-EC"/>
-              </w:rPr>
-              <w:t xml:space="preserve">Hardware</w:t>
-            </w:r>
-          </w:p>
-        </w:tc>
-        <w:tc>
-          <w:tcPr>
-            <w:tcW w:w="3700" w:type="dxa"/>
-            <w:vAlign w:val="center"/>
-          </w:tcPr>
-          <w:p>
-            <w:pPr>
-              <w:spacing w:before="0" w:after="0" w:line="240" w:lineRule="auto"/>
-              <w:jc w:val="left"/>
-            </w:pPr>
-            <w:r>
-              <w:rPr>
-                <w:rFonts w:ascii="Arial" w:hAnsi="Arial" w:cs="Arial"/>
-                <w:sz w:val="20"/>
-                <w:szCs w:val="20"/>
-                <w:lang w:val="es-EC"/>
-              </w:rPr>
-              <w:t xml:space="preserve">Computador portátil con Windows 11</w:t>
-            </w:r>
-          </w:p>
-        </w:tc>
-        <w:tc>
-          <w:tcPr>
-            <w:tcW w:w="3498" w:type="dxa"/>
-            <w:vAlign w:val="center"/>
-          </w:tcPr>
-          <w:p>
-            <w:pPr>
-              <w:spacing w:before="0" w:after="0" w:line="240" w:lineRule="auto"/>
-              <w:jc w:val="left"/>
-            </w:pPr>
-            <w:r>
-              <w:rPr>
-                <w:rFonts w:ascii="Arial" w:hAnsi="Arial" w:cs="Arial"/>
-                <w:sz w:val="20"/>
-                <w:szCs w:val="20"/>
-                <w:lang w:val="es-EC"/>
-              </w:rPr>
-              <w:t xml:space="preserve">Desarrollo, ejecución local y pruebas (localhost)</w:t>
-            </w:r>
-          </w:p>
-        </w:tc>
-      </w:tr>
-      <w:tr>
-        <w:trPr>
-          <w:cantSplit/>
-        </w:trPr>
-        <w:tc>
-          <w:tcPr>
-            <w:tcW w:w="1300" w:type="dxa"/>
-            <w:vAlign w:val="center"/>
-          </w:tcPr>
-          <w:p>
-            <w:pPr>
-              <w:spacing w:before="0" w:after="0" w:line="240" w:lineRule="auto"/>
-              <w:jc w:val="left"/>
-            </w:pPr>
-            <w:r>
-              <w:rPr>
-                <w:rFonts w:ascii="Arial" w:hAnsi="Arial" w:cs="Arial"/>
-                <w:sz w:val="20"/>
-                <w:szCs w:val="20"/>
-                <w:lang w:val="es-EC"/>
-              </w:rPr>
-              <w:t xml:space="preserve">Software</w:t>
-            </w:r>
-          </w:p>
-        </w:tc>
-        <w:tc>
-          <w:tcPr>
-            <w:tcW w:w="3700" w:type="dxa"/>
-            <w:vAlign w:val="center"/>
-          </w:tcPr>
-          <w:p>
-            <w:pPr>
-              <w:spacing w:before="0" w:after="0" w:line="240" w:lineRule="auto"/>
-              <w:jc w:val="left"/>
-            </w:pPr>
-            <w:r>
-              <w:rPr>
-                <w:rFonts w:ascii="Arial" w:hAnsi="Arial" w:cs="Arial"/>
-                <w:sz w:val="20"/>
-                <w:szCs w:val="20"/>
-                <w:lang w:val="es-EC"/>
-              </w:rPr>
-              <w:t xml:space="preserve">Visual Studio Code</w:t>
-            </w:r>
-          </w:p>
-        </w:tc>
-        <w:tc>
-          <w:tcPr>
-            <w:tcW w:w="3498" w:type="dxa"/>
-            <w:vAlign w:val="center"/>
-          </w:tcPr>
-          <w:p>
-            <w:pPr>
-              <w:spacing w:before="0" w:after="0" w:line="240" w:lineRule="auto"/>
-              <w:jc w:val="left"/>
-            </w:pPr>
-            <w:r>
-              <w:rPr>
-                <w:rFonts w:ascii="Arial" w:hAnsi="Arial" w:cs="Arial"/>
-                <w:sz w:val="20"/>
-                <w:szCs w:val="20"/>
-                <w:lang w:val="es-EC"/>
-              </w:rPr>
-              <w:t xml:space="preserve">Editor de código y terminal integrada</w:t>
-            </w:r>
-          </w:p>
-        </w:tc>
-      </w:tr>
-      <w:tr>
-        <w:trPr>
-          <w:cantSplit/>
-        </w:trPr>
-        <w:tc>
-          <w:tcPr>
-            <w:tcW w:w="1300" w:type="dxa"/>
-            <w:vAlign w:val="center"/>
-          </w:tcPr>
-          <w:p>
-            <w:pPr>
-              <w:spacing w:before="0" w:after="0" w:line="240" w:lineRule="auto"/>
-              <w:jc w:val="left"/>
-            </w:pPr>
-            <w:r>
-              <w:rPr>
-                <w:rFonts w:ascii="Arial" w:hAnsi="Arial" w:cs="Arial"/>
-                <w:sz w:val="20"/>
-                <w:szCs w:val="20"/>
-                <w:lang w:val="es-EC"/>
-              </w:rPr>
-              <w:t xml:space="preserve">Software</w:t>
-            </w:r>
-          </w:p>
-        </w:tc>
-        <w:tc>
-          <w:tcPr>
-            <w:tcW w:w="3700" w:type="dxa"/>
-            <w:vAlign w:val="center"/>
-          </w:tcPr>
-          <w:p>
-            <w:pPr>
-              <w:spacing w:before="0" w:after="0" w:line="240" w:lineRule="auto"/>
-              <w:jc w:val="left"/>
-            </w:pPr>
-            <w:r>
-              <w:rPr>
-                <w:rFonts w:ascii="Arial" w:hAnsi="Arial" w:cs="Arial"/>
-                <w:sz w:val="20"/>
-                <w:szCs w:val="20"/>
-                <w:lang w:val="es-EC"/>
-              </w:rPr>
-              <w:t xml:space="preserve">.NET 10 SDK · ASP.NET Core 10 Web API (C#)</w:t>
-            </w:r>
-          </w:p>
-        </w:tc>
-        <w:tc>
-          <w:tcPr>
-            <w:tcW w:w="3498" w:type="dxa"/>
-            <w:vAlign w:val="center"/>
-          </w:tcPr>
-          <w:p>
-            <w:pPr>
-              <w:spacing w:before="0" w:after="0" w:line="240" w:lineRule="auto"/>
-              <w:jc w:val="left"/>
-            </w:pPr>
-            <w:r>
-              <w:rPr>
-                <w:rFonts w:ascii="Arial" w:hAnsi="Arial" w:cs="Arial"/>
-                <w:sz w:val="20"/>
-                <w:szCs w:val="20"/>
-                <w:lang w:val="es-EC"/>
-              </w:rPr>
-              <w:t xml:space="preserve">Backend: controladores, servicios y seguridad</w:t>
-            </w:r>
-          </w:p>
-        </w:tc>
-      </w:tr>
-      <w:tr>
-        <w:trPr>
-          <w:cantSplit/>
-        </w:trPr>
-        <w:tc>
-          <w:tcPr>
-            <w:tcW w:w="1300" w:type="dxa"/>
-            <w:vAlign w:val="center"/>
-          </w:tcPr>
-          <w:p>
-            <w:pPr>
-              <w:spacing w:before="0" w:after="0" w:line="240" w:lineRule="auto"/>
-              <w:jc w:val="left"/>
-            </w:pPr>
-            <w:r>
-              <w:rPr>
-                <w:rFonts w:ascii="Arial" w:hAnsi="Arial" w:cs="Arial"/>
-                <w:sz w:val="20"/>
-                <w:szCs w:val="20"/>
-                <w:lang w:val="es-EC"/>
-              </w:rPr>
-              <w:t xml:space="preserve">Software</w:t>
-            </w:r>
-          </w:p>
-        </w:tc>
-        <w:tc>
-          <w:tcPr>
-            <w:tcW w:w="3700" w:type="dxa"/>
-            <w:vAlign w:val="center"/>
-          </w:tcPr>
-          <w:p>
-            <w:pPr>
-              <w:spacing w:before="0" w:after="0" w:line="240" w:lineRule="auto"/>
-              <w:jc w:val="left"/>
-            </w:pPr>
-            <w:r>
-              <w:rPr>
-                <w:rFonts w:ascii="Arial" w:hAnsi="Arial" w:cs="Arial"/>
-                <w:sz w:val="20"/>
-                <w:szCs w:val="20"/>
-                <w:lang w:val="es-EC"/>
-              </w:rPr>
-              <w:t xml:space="preserve">Entity Framework Core 10 · Npgsql 10.0.3 · dotnet-ef</w:t>
-            </w:r>
-          </w:p>
-        </w:tc>
-        <w:tc>
-          <w:tcPr>
-            <w:tcW w:w="3498" w:type="dxa"/>
-            <w:vAlign w:val="center"/>
-          </w:tcPr>
-          <w:p>
-            <w:pPr>
-              <w:spacing w:before="0" w:after="0" w:line="240" w:lineRule="auto"/>
-              <w:jc w:val="left"/>
-            </w:pPr>
-            <w:r>
-              <w:rPr>
-                <w:rFonts w:ascii="Arial" w:hAnsi="Arial" w:cs="Arial"/>
-                <w:sz w:val="20"/>
-                <w:szCs w:val="20"/>
-                <w:lang w:val="es-EC"/>
-              </w:rPr>
-              <w:t xml:space="preserve">Acceso a datos y migraciones</w:t>
-            </w:r>
-          </w:p>
-        </w:tc>
-      </w:tr>
-      <w:tr>
-        <w:trPr>
-          <w:cantSplit/>
-        </w:trPr>
-        <w:tc>
-          <w:tcPr>
-            <w:tcW w:w="1300" w:type="dxa"/>
-            <w:vAlign w:val="center"/>
-          </w:tcPr>
-          <w:p>
-            <w:pPr>
-              <w:spacing w:before="0" w:after="0" w:line="240" w:lineRule="auto"/>
-              <w:jc w:val="left"/>
-            </w:pPr>
-            <w:r>
-              <w:rPr>
-                <w:rFonts w:ascii="Arial" w:hAnsi="Arial" w:cs="Arial"/>
-                <w:sz w:val="20"/>
-                <w:szCs w:val="20"/>
-                <w:lang w:val="es-EC"/>
-              </w:rPr>
-              <w:t xml:space="preserve">Software</w:t>
-            </w:r>
-          </w:p>
-        </w:tc>
-        <w:tc>
-          <w:tcPr>
-            <w:tcW w:w="3700" w:type="dxa"/>
-            <w:vAlign w:val="center"/>
-          </w:tcPr>
-          <w:p>
-            <w:pPr>
-              <w:spacing w:before="0" w:after="0" w:line="240" w:lineRule="auto"/>
-              <w:jc w:val="left"/>
-            </w:pPr>
-            <w:r>
-              <w:rPr>
-                <w:rFonts w:ascii="Arial" w:hAnsi="Arial" w:cs="Arial"/>
-                <w:sz w:val="20"/>
-                <w:szCs w:val="20"/>
-                <w:lang w:val="es-EC"/>
-              </w:rPr>
-              <w:t xml:space="preserve">PostgreSQL y pgAdmin 4</w:t>
-            </w:r>
-          </w:p>
-        </w:tc>
-        <w:tc>
-          <w:tcPr>
-            <w:tcW w:w="3498" w:type="dxa"/>
-            <w:vAlign w:val="center"/>
-          </w:tcPr>
-          <w:p>
-            <w:pPr>
-              <w:spacing w:before="0" w:after="0" w:line="240" w:lineRule="auto"/>
-              <w:jc w:val="left"/>
-            </w:pPr>
-            <w:r>
-              <w:rPr>
-                <w:rFonts w:ascii="Arial" w:hAnsi="Arial" w:cs="Arial"/>
-                <w:sz w:val="20"/>
-                <w:szCs w:val="20"/>
-                <w:lang w:val="es-EC"/>
-              </w:rPr>
-              <w:t xml:space="preserve">Base de datos y verificación de tablas</w:t>
-            </w:r>
-          </w:p>
-        </w:tc>
-      </w:tr>
-      <w:tr>
-        <w:trPr>
-          <w:cantSplit/>
-        </w:trPr>
-        <w:tc>
-          <w:tcPr>
-            <w:tcW w:w="1300" w:type="dxa"/>
-            <w:vAlign w:val="center"/>
-          </w:tcPr>
-          <w:p>
-            <w:pPr>
-              <w:spacing w:before="0" w:after="0" w:line="240" w:lineRule="auto"/>
-              <w:jc w:val="left"/>
-            </w:pPr>
-            <w:r>
-              <w:rPr>
-                <w:rFonts w:ascii="Arial" w:hAnsi="Arial" w:cs="Arial"/>
-                <w:sz w:val="20"/>
-                <w:szCs w:val="20"/>
-                <w:lang w:val="es-EC"/>
-              </w:rPr>
-              <w:t xml:space="preserve">Software</w:t>
-            </w:r>
-          </w:p>
-        </w:tc>
-        <w:tc>
-          <w:tcPr>
-            <w:tcW w:w="3700" w:type="dxa"/>
-            <w:vAlign w:val="center"/>
-          </w:tcPr>
-          <w:p>
-            <w:pPr>
-              <w:spacing w:before="0" w:after="0" w:line="240" w:lineRule="auto"/>
-              <w:jc w:val="left"/>
-            </w:pPr>
-            <w:r>
-              <w:rPr>
-                <w:rFonts w:ascii="Arial" w:hAnsi="Arial" w:cs="Arial"/>
-                <w:sz w:val="20"/>
-                <w:szCs w:val="20"/>
-                <w:lang w:val="es-EC"/>
-              </w:rPr>
-              <w:t xml:space="preserve">Node.js, npm y Angular 22 (CLI)</w:t>
-            </w:r>
-          </w:p>
-        </w:tc>
-        <w:tc>
-          <w:tcPr>
-            <w:tcW w:w="3498" w:type="dxa"/>
-            <w:vAlign w:val="center"/>
-          </w:tcPr>
-          <w:p>
-            <w:pPr>
-              <w:spacing w:before="0" w:after="0" w:line="240" w:lineRule="auto"/>
-              <w:jc w:val="left"/>
-            </w:pPr>
-            <w:r>
-              <w:rPr>
-                <w:rFonts w:ascii="Arial" w:hAnsi="Arial" w:cs="Arial"/>
-                <w:sz w:val="20"/>
-                <w:szCs w:val="20"/>
-                <w:lang w:val="es-EC"/>
-              </w:rPr>
-              <w:t xml:space="preserve">Frontend de la aplicación</w:t>
-            </w:r>
-          </w:p>
-        </w:tc>
-      </w:tr>
-      <w:tr>
-        <w:trPr>
-          <w:cantSplit/>
-        </w:trPr>
-        <w:tc>
-          <w:tcPr>
-            <w:tcW w:w="1300" w:type="dxa"/>
-            <w:vAlign w:val="center"/>
-          </w:tcPr>
-          <w:p>
-            <w:pPr>
-              <w:spacing w:before="0" w:after="0" w:line="240" w:lineRule="auto"/>
-              <w:jc w:val="left"/>
-            </w:pPr>
-            <w:r>
-              <w:rPr>
-                <w:rFonts w:ascii="Arial" w:hAnsi="Arial" w:cs="Arial"/>
-                <w:sz w:val="20"/>
-                <w:szCs w:val="20"/>
-                <w:lang w:val="es-EC"/>
-              </w:rPr>
-              <w:t xml:space="preserve">Software</w:t>
-            </w:r>
-          </w:p>
-        </w:tc>
-        <w:tc>
-          <w:tcPr>
-            <w:tcW w:w="3700" w:type="dxa"/>
-            <w:vAlign w:val="center"/>
-          </w:tcPr>
-          <w:p>
-            <w:pPr>
-              <w:spacing w:before="0" w:after="0" w:line="240" w:lineRule="auto"/>
-              <w:jc w:val="left"/>
-            </w:pPr>
-            <w:r>
-              <w:rPr>
-                <w:rFonts w:ascii="Arial" w:hAnsi="Arial" w:cs="Arial"/>
-                <w:sz w:val="20"/>
-                <w:szCs w:val="20"/>
-                <w:lang w:val="es-EC"/>
-              </w:rPr>
-              <w:t xml:space="preserve">Microsoft.AspNetCore.Authentication.JwtBearer 10.0.12</w:t>
-            </w:r>
-          </w:p>
-        </w:tc>
-        <w:tc>
-          <w:tcPr>
-            <w:tcW w:w="3498" w:type="dxa"/>
-            <w:vAlign w:val="center"/>
-          </w:tcPr>
-          <w:p>
-            <w:pPr>
-              <w:spacing w:before="0" w:after="0" w:line="240" w:lineRule="auto"/>
-              <w:jc w:val="left"/>
-            </w:pPr>
-            <w:r>
-              <w:rPr>
-                <w:rFonts w:ascii="Arial" w:hAnsi="Arial" w:cs="Arial"/>
-                <w:sz w:val="20"/>
-                <w:szCs w:val="20"/>
-                <w:lang w:val="es-EC"/>
-              </w:rPr>
-              <w:t xml:space="preserve">Validación de los tokens JWT</w:t>
-            </w:r>
-          </w:p>
-        </w:tc>
-      </w:tr>
-      <w:tr>
-        <w:trPr>
-          <w:cantSplit/>
-        </w:trPr>
-        <w:tc>
-          <w:tcPr>
-            <w:tcW w:w="1300" w:type="dxa"/>
-            <w:vAlign w:val="center"/>
-          </w:tcPr>
-          <w:p>
-            <w:pPr>
-              <w:spacing w:before="0" w:after="0" w:line="240" w:lineRule="auto"/>
-              <w:jc w:val="left"/>
-            </w:pPr>
-            <w:r>
-              <w:rPr>
-                <w:rFonts w:ascii="Arial" w:hAnsi="Arial" w:cs="Arial"/>
-                <w:sz w:val="20"/>
-                <w:szCs w:val="20"/>
-                <w:lang w:val="es-EC"/>
-              </w:rPr>
-              <w:t xml:space="preserve">Software</w:t>
-            </w:r>
-          </w:p>
-        </w:tc>
-        <w:tc>
-          <w:tcPr>
-            <w:tcW w:w="3700" w:type="dxa"/>
-            <w:vAlign w:val="center"/>
-          </w:tcPr>
-          <w:p>
-            <w:pPr>
-              <w:spacing w:before="0" w:after="0" w:line="240" w:lineRule="auto"/>
-              <w:jc w:val="left"/>
-            </w:pPr>
-            <w:r>
-              <w:rPr>
-                <w:rFonts w:ascii="Arial" w:hAnsi="Arial" w:cs="Arial"/>
-                <w:sz w:val="20"/>
-                <w:szCs w:val="20"/>
-                <w:lang w:val="es-EC"/>
-              </w:rPr>
-              <w:t xml:space="preserve">Postman y PowerShell</w:t>
-            </w:r>
-          </w:p>
-        </w:tc>
-        <w:tc>
-          <w:tcPr>
-            <w:tcW w:w="3498" w:type="dxa"/>
-            <w:vAlign w:val="center"/>
-          </w:tcPr>
-          <w:p>
-            <w:pPr>
-              <w:spacing w:before="0" w:after="0" w:line="240" w:lineRule="auto"/>
-              <w:jc w:val="left"/>
-            </w:pPr>
-            <w:r>
-              <w:rPr>
-                <w:rFonts w:ascii="Arial" w:hAnsi="Arial" w:cs="Arial"/>
-                <w:sz w:val="20"/>
-                <w:szCs w:val="20"/>
-                <w:lang w:val="es-EC"/>
-              </w:rPr>
-              <w:t xml:space="preserve">Pruebas manuales y automatizadas de la API</w:t>
-            </w:r>
-          </w:p>
-        </w:tc>
-      </w:tr>
-      <w:tr>
-        <w:trPr>
-          <w:cantSplit/>
-        </w:trPr>
-        <w:tc>
-          <w:tcPr>
-            <w:tcW w:w="1300" w:type="dxa"/>
-            <w:vAlign w:val="center"/>
-          </w:tcPr>
-          <w:p>
-            <w:pPr>
-              <w:spacing w:before="0" w:after="0" w:line="240" w:lineRule="auto"/>
-              <w:jc w:val="left"/>
-            </w:pPr>
-            <w:r>
-              <w:rPr>
-                <w:rFonts w:ascii="Arial" w:hAnsi="Arial" w:cs="Arial"/>
-                <w:sz w:val="20"/>
-                <w:szCs w:val="20"/>
-                <w:lang w:val="es-EC"/>
-              </w:rPr>
-              <w:t xml:space="preserve">Software</w:t>
-            </w:r>
-          </w:p>
-        </w:tc>
-        <w:tc>
-          <w:tcPr>
-            <w:tcW w:w="3700" w:type="dxa"/>
-            <w:vAlign w:val="center"/>
-          </w:tcPr>
-          <w:p>
-            <w:pPr>
-              <w:spacing w:before="0" w:after="0" w:line="240" w:lineRule="auto"/>
-              <w:jc w:val="left"/>
-            </w:pPr>
-            <w:r>
-              <w:rPr>
-                <w:rFonts w:ascii="Arial" w:hAnsi="Arial" w:cs="Arial"/>
-                <w:sz w:val="20"/>
-                <w:szCs w:val="20"/>
-                <w:lang w:val="es-EC"/>
-              </w:rPr>
-              <w:t xml:space="preserve">Git y GitHub</w:t>
-            </w:r>
-          </w:p>
-        </w:tc>
-        <w:tc>
-          <w:tcPr>
-            <w:tcW w:w="3498" w:type="dxa"/>
-            <w:vAlign w:val="center"/>
-          </w:tcPr>
-          <w:p>
-            <w:pPr>
-              <w:spacing w:before="0" w:after="0" w:line="240" w:lineRule="auto"/>
-              <w:jc w:val="left"/>
-            </w:pPr>
-            <w:r>
-              <w:rPr>
-                <w:rFonts w:ascii="Arial" w:hAnsi="Arial" w:cs="Arial"/>
-                <w:sz w:val="20"/>
-                <w:szCs w:val="20"/>
-                <w:lang w:val="es-EC"/>
-              </w:rPr>
-              <w:t xml:space="preserve">Control de versiones y repositorio público</w:t>
-            </w:r>
-          </w:p>
-        </w:tc>
-      </w:tr>
-      <w:tr>
-        <w:trPr>
-          <w:cantSplit/>
-        </w:trPr>
-        <w:tc>
-          <w:tcPr>
-            <w:tcW w:w="1300" w:type="dxa"/>
-            <w:vAlign w:val="center"/>
-          </w:tcPr>
-          <w:p>
-            <w:pPr>
-              <w:spacing w:before="0" w:after="0" w:line="240" w:lineRule="auto"/>
-              <w:jc w:val="left"/>
-            </w:pPr>
-            <w:r>
-              <w:rPr>
-                <w:rFonts w:ascii="Arial" w:hAnsi="Arial" w:cs="Arial"/>
-                <w:sz w:val="20"/>
-                <w:szCs w:val="20"/>
-                <w:lang w:val="es-EC"/>
-              </w:rPr>
-              <w:t xml:space="preserve">Software</w:t>
-            </w:r>
-          </w:p>
-        </w:tc>
-        <w:tc>
-          <w:tcPr>
-            <w:tcW w:w="3700" w:type="dxa"/>
-            <w:vAlign w:val="center"/>
-          </w:tcPr>
-          <w:p>
-            <w:pPr>
-              <w:spacing w:before="0" w:after="0" w:line="240" w:lineRule="auto"/>
-              <w:jc w:val="left"/>
-            </w:pPr>
-            <w:r>
-              <w:rPr>
-                <w:rFonts w:ascii="Arial" w:hAnsi="Arial" w:cs="Arial"/>
-                <w:sz w:val="20"/>
-                <w:szCs w:val="20"/>
-                <w:lang w:val="es-EC"/>
-              </w:rPr>
-              <w:t xml:space="preserve">Navegador web con herramientas de desarrollador (F12)</w:t>
-            </w:r>
-          </w:p>
-        </w:tc>
-        <w:tc>
-          <w:tcPr>
-            <w:tcW w:w="3498" w:type="dxa"/>
-            <w:vAlign w:val="center"/>
-          </w:tcPr>
-          <w:p>
-            <w:pPr>
-              <w:spacing w:before="0" w:after="0" w:line="240" w:lineRule="auto"/>
-              <w:jc w:val="left"/>
-            </w:pPr>
-            <w:r>
-              <w:rPr>
-                <w:rFonts w:ascii="Arial" w:hAnsi="Arial" w:cs="Arial"/>
-                <w:sz w:val="20"/>
-                <w:szCs w:val="20"/>
-                <w:lang w:val="es-EC"/>
-              </w:rPr>
-              <w:t xml:space="preserve">Pruebas de la interfaz y revisión del token</w:t>
-            </w:r>
-          </w:p>
-        </w:tc>
-      </w:tr>
-      <w:tr>
-        <w:trPr>
-          <w:cantSplit/>
-        </w:trPr>
-        <w:tc>
-          <w:tcPr>
-            <w:tcW w:w="1300" w:type="dxa"/>
-            <w:vAlign w:val="center"/>
-          </w:tcPr>
-          <w:p>
-            <w:pPr>
-              <w:spacing w:before="0" w:after="0" w:line="240" w:lineRule="auto"/>
-              <w:jc w:val="left"/>
-            </w:pPr>
-            <w:r>
-              <w:rPr>
-                <w:rFonts w:ascii="Arial" w:hAnsi="Arial" w:cs="Arial"/>
-                <w:sz w:val="20"/>
-                <w:szCs w:val="20"/>
-                <w:lang w:val="es-EC"/>
-              </w:rPr>
-              <w:t xml:space="preserve">Humanos</w:t>
-            </w:r>
-          </w:p>
-        </w:tc>
-        <w:tc>
-          <w:tcPr>
-            <w:tcW w:w="3700" w:type="dxa"/>
-            <w:vAlign w:val="center"/>
-          </w:tcPr>
-          <w:p>
-            <w:pPr>
-              <w:spacing w:before="0" w:after="0" w:line="240" w:lineRule="auto"/>
-              <w:jc w:val="left"/>
-            </w:pPr>
-            <w:r>
-              <w:rPr>
-                <w:rFonts w:ascii="Arial" w:hAnsi="Arial" w:cs="Arial"/>
-                <w:sz w:val="20"/>
-                <w:szCs w:val="20"/>
-                <w:lang w:val="es-EC"/>
-              </w:rPr>
-              <w:t xml:space="preserve">Dos estudiantes y el docente de la asignatura</w:t>
-            </w:r>
-          </w:p>
-        </w:tc>
-        <w:tc>
-          <w:tcPr>
-            <w:tcW w:w="3498" w:type="dxa"/>
-            <w:vAlign w:val="center"/>
-          </w:tcPr>
-          <w:p>
-            <w:pPr>
-              <w:spacing w:before="0" w:after="0" w:line="240" w:lineRule="auto"/>
-              <w:jc w:val="left"/>
-            </w:pPr>
-            <w:r>
-              <w:rPr>
-                <w:rFonts w:ascii="Arial" w:hAnsi="Arial" w:cs="Arial"/>
-                <w:sz w:val="20"/>
-                <w:szCs w:val="20"/>
-                <w:lang w:val="es-EC"/>
-              </w:rPr>
-              <w:t xml:space="preserve">Desarrollo, revisión y retroalimentación</w:t>
-            </w:r>
-          </w:p>
-        </w:tc>
-      </w:tr>
-    </w:tbl>
-    <w:p>
-      <w:pPr>
-        <w:spacing w:before="0" w:after="120" w:line="276" w:lineRule="auto"/>
-        <w:jc w:val="both"/>
-      </w:pPr>
-    </w:p>
-    <w:p>
-      <w:pPr>
-        <w:pStyle w:val="Prrafodelista"/>
-        <w:keepNext/>
-        <w:numPr>
-          <w:ilvl w:val="0"/>
-          <w:numId w:val="10"/>
-        </w:numPr>
-        <w:spacing w:before="280" w:after="140" w:line="276" w:lineRule="auto"/>
-        <w:ind w:left="360" w:hanging="360"/>
-        <w:jc w:val="left"/>
-      </w:pPr>
-      <w:r>
-        <w:rPr>
-          <w:rFonts w:ascii="Arial" w:hAnsi="Arial" w:cs="Arial"/>
-          <w:b/>
-          <w:bCs/>
-          <w:sz w:val="24"/>
-          <w:szCs w:val="24"/>
-          <w:lang w:val="es-EC"/>
-        </w:rPr>
-        <w:t xml:space="preserve">Desarrollo</w:t>
-      </w:r>
-    </w:p>
-    <w:p>
-      <w:pPr>
-        <w:spacing w:before="0" w:after="160" w:line="276" w:lineRule="auto"/>
-        <w:jc w:val="both"/>
-      </w:pPr>
-      <w:r>
-        <w:rPr>
-          <w:rFonts w:ascii="Arial" w:hAnsi="Arial" w:cs="Arial"/>
-          <w:sz w:val="24"/>
-          <w:szCs w:val="24"/>
-          <w:lang w:val="es-EC"/>
-        </w:rPr>
-        <w:t xml:space="preserve">El trabajo se organizó en fases que siguen el orden de las clases de la asignatura. Cada fase terminó con un commit en GitHub, de modo que el historial del repositorio muestra la evolución del proyecto.</w:t>
-      </w:r>
-    </w:p>
-    <w:p>
-      <w:pPr>
-        <w:keepNext/>
-        <w:spacing w:before="220" w:after="100" w:line="276" w:lineRule="auto"/>
-        <w:jc w:val="left"/>
-      </w:pPr>
-      <w:r>
-        <w:rPr>
-          <w:rFonts w:ascii="Arial" w:hAnsi="Arial" w:cs="Arial"/>
-          <w:b/>
-          <w:bCs/>
-          <w:sz w:val="24"/>
-          <w:szCs w:val="24"/>
-          <w:lang w:val="es-EC"/>
-        </w:rPr>
-        <w:t xml:space="preserve">6.1. Fase 1: Control de versiones y estructura del proyecto</w:t>
-      </w:r>
-    </w:p>
-    <w:p>
-      <w:pPr>
-        <w:spacing w:before="0" w:after="160" w:line="276" w:lineRule="auto"/>
-        <w:jc w:val="both"/>
-      </w:pPr>
-      <w:r>
-        <w:rPr>
-          <w:rFonts w:ascii="Arial" w:hAnsi="Arial" w:cs="Arial"/>
-          <w:sz w:val="24"/>
-          <w:szCs w:val="24"/>
-          <w:lang w:val="es-EC"/>
-        </w:rPr>
-        <w:t xml:space="preserve">Git es un sistema de control de versiones distribuido que guarda el historial de cambios, registra quién hizo cada cambio y permite volver a versiones anteriores (Chacon y Straub, 2014). Se creó un repositorio público en GitHub y se definió una estructura que separa cada parte del sistema:</w:t>
+          <w:color w:val="auto"/>
+          <w:sz w:val="24"/>
+          <w:szCs w:val="24"/>
+        </w:rPr>
+        <w:t>Recursos necesarios</w:t>
       </w:r>
     </w:p>
     <w:p>
@@ -1929,21 +1103,23 @@
       </w:pPr>
       <w:r>
         <w:rPr>
-          <w:rFonts w:ascii="Consolas" w:hAnsi="Consolas" w:cs="Consolas"/>
-          <w:sz w:val="21"/>
-          <w:szCs w:val="21"/>
-          <w:lang w:val="es-EC"/>
-        </w:rPr>
-        <w:t xml:space="preserve">frontend/timebank-web</w:t>
-      </w:r>
-      <w:r>
-        <w:rPr>
-          <w:rFonts w:ascii="Arial" w:hAnsi="Arial" w:cs="Arial"/>
-          <w:sz w:val="24"/>
-          <w:szCs w:val="24"/>
-          <w:lang w:val="es-EC"/>
-        </w:rPr>
-        <w:t xml:space="preserve">: aplicación Angular.</w:t>
+          <w:rFonts w:ascii="Arial" w:hAnsi="Arial" w:cs="Arial"/>
+          <w:b/>
+          <w:bCs/>
+          <w:sz w:val="24"/>
+          <w:szCs w:val="24"/>
+          <w:lang w:val="es-EC"/>
+        </w:rPr>
+        <w:t xml:space="preserve">Hardware:</w:t>
+      </w:r>
+      <w:r>
+        <w:rPr>
+          <w:rFonts w:ascii="Arial" w:hAnsi="Arial" w:cs="Arial"/>
+          <w:sz w:val="24"/>
+          <w:szCs w:val="24"/>
+          <w:lang w:val="es-EC"/>
+        </w:rPr>
+        <w:t xml:space="preserve"> computador portátil con Windows 11 para el desarrollo, la ejecución local (localhost) y las pruebas.</w:t>
       </w:r>
     </w:p>
     <w:p>
@@ -1959,21 +1135,23 @@
       </w:pPr>
       <w:r>
         <w:rPr>
-          <w:rFonts w:ascii="Consolas" w:hAnsi="Consolas" w:cs="Consolas"/>
-          <w:sz w:val="21"/>
-          <w:szCs w:val="21"/>
-          <w:lang w:val="es-EC"/>
-        </w:rPr>
-        <w:t xml:space="preserve">backend/TimeBank.API</w:t>
-      </w:r>
-      <w:r>
-        <w:rPr>
-          <w:rFonts w:ascii="Arial" w:hAnsi="Arial" w:cs="Arial"/>
-          <w:sz w:val="24"/>
-          <w:szCs w:val="24"/>
-          <w:lang w:val="es-EC"/>
-        </w:rPr>
-        <w:t xml:space="preserve">: API en ASP.NET Core, organizada en Controllers, Services, Dtos, Models, Data, Security, Extensions y Migrations.</w:t>
+          <w:rFonts w:ascii="Arial" w:hAnsi="Arial" w:cs="Arial"/>
+          <w:b/>
+          <w:bCs/>
+          <w:sz w:val="24"/>
+          <w:szCs w:val="24"/>
+          <w:lang w:val="es-EC"/>
+        </w:rPr>
+        <w:t xml:space="preserve">Editor:</w:t>
+      </w:r>
+      <w:r>
+        <w:rPr>
+          <w:rFonts w:ascii="Arial" w:hAnsi="Arial" w:cs="Arial"/>
+          <w:sz w:val="24"/>
+          <w:szCs w:val="24"/>
+          <w:lang w:val="es-EC"/>
+        </w:rPr>
+        <w:t xml:space="preserve"> Visual Studio Code con terminal integrada.</w:t>
       </w:r>
     </w:p>
     <w:p>
@@ -1989,6 +1167,402 @@
       </w:pPr>
       <w:r>
         <w:rPr>
+          <w:rFonts w:ascii="Arial" w:hAnsi="Arial" w:cs="Arial"/>
+          <w:b/>
+          <w:bCs/>
+          <w:sz w:val="24"/>
+          <w:szCs w:val="24"/>
+          <w:lang w:val="es-EC"/>
+        </w:rPr>
+        <w:t xml:space="preserve">Backend:</w:t>
+      </w:r>
+      <w:r>
+        <w:rPr>
+          <w:rFonts w:ascii="Arial" w:hAnsi="Arial" w:cs="Arial"/>
+          <w:sz w:val="24"/>
+          <w:szCs w:val="24"/>
+          <w:lang w:val="es-EC"/>
+        </w:rPr>
+        <w:t xml:space="preserve"> .NET 10 SDK y ASP.NET Core 10 Web API con C#.</w:t>
+      </w:r>
+    </w:p>
+    <w:p>
+      <w:pPr>
+        <w:pStyle w:val="Prrafodelista"/>
+        <w:numPr>
+          <w:ilvl w:val="0"/>
+          <w:numId w:val="19"/>
+        </w:numPr>
+        <w:spacing w:before="0" w:after="80" w:line="276" w:lineRule="auto"/>
+        <w:ind w:left="720" w:hanging="360"/>
+        <w:jc w:val="left"/>
+      </w:pPr>
+      <w:r>
+        <w:rPr>
+          <w:rFonts w:ascii="Arial" w:hAnsi="Arial" w:cs="Arial"/>
+          <w:b/>
+          <w:bCs/>
+          <w:sz w:val="24"/>
+          <w:szCs w:val="24"/>
+          <w:lang w:val="es-EC"/>
+        </w:rPr>
+        <w:t xml:space="preserve">Acceso a datos:</w:t>
+      </w:r>
+      <w:r>
+        <w:rPr>
+          <w:rFonts w:ascii="Arial" w:hAnsi="Arial" w:cs="Arial"/>
+          <w:sz w:val="24"/>
+          <w:szCs w:val="24"/>
+          <w:lang w:val="es-EC"/>
+        </w:rPr>
+        <w:t xml:space="preserve"> Entity Framework Core 10, Npgsql 10.0.3 y la herramienta dotnet-ef para las migraciones.</w:t>
+      </w:r>
+    </w:p>
+    <w:p>
+      <w:pPr>
+        <w:pStyle w:val="Prrafodelista"/>
+        <w:numPr>
+          <w:ilvl w:val="0"/>
+          <w:numId w:val="19"/>
+        </w:numPr>
+        <w:spacing w:before="0" w:after="80" w:line="276" w:lineRule="auto"/>
+        <w:ind w:left="720" w:hanging="360"/>
+        <w:jc w:val="left"/>
+      </w:pPr>
+      <w:r>
+        <w:rPr>
+          <w:rFonts w:ascii="Arial" w:hAnsi="Arial" w:cs="Arial"/>
+          <w:b/>
+          <w:bCs/>
+          <w:sz w:val="24"/>
+          <w:szCs w:val="24"/>
+          <w:lang w:val="es-EC"/>
+        </w:rPr>
+        <w:t xml:space="preserve">Base de datos:</w:t>
+      </w:r>
+      <w:r>
+        <w:rPr>
+          <w:rFonts w:ascii="Arial" w:hAnsi="Arial" w:cs="Arial"/>
+          <w:sz w:val="24"/>
+          <w:szCs w:val="24"/>
+          <w:lang w:val="es-EC"/>
+        </w:rPr>
+        <w:t xml:space="preserve"> PostgreSQL y pgAdmin 4.</w:t>
+      </w:r>
+    </w:p>
+    <w:p>
+      <w:pPr>
+        <w:pStyle w:val="Prrafodelista"/>
+        <w:numPr>
+          <w:ilvl w:val="0"/>
+          <w:numId w:val="19"/>
+        </w:numPr>
+        <w:spacing w:before="0" w:after="80" w:line="276" w:lineRule="auto"/>
+        <w:ind w:left="720" w:hanging="360"/>
+        <w:jc w:val="left"/>
+      </w:pPr>
+      <w:r>
+        <w:rPr>
+          <w:rFonts w:ascii="Arial" w:hAnsi="Arial" w:cs="Arial"/>
+          <w:b/>
+          <w:bCs/>
+          <w:sz w:val="24"/>
+          <w:szCs w:val="24"/>
+          <w:lang w:val="es-EC"/>
+        </w:rPr>
+        <w:t xml:space="preserve">Seguridad:</w:t>
+      </w:r>
+      <w:r>
+        <w:rPr>
+          <w:rFonts w:ascii="Arial" w:hAnsi="Arial" w:cs="Arial"/>
+          <w:sz w:val="24"/>
+          <w:szCs w:val="24"/>
+          <w:lang w:val="es-EC"/>
+        </w:rPr>
+        <w:t xml:space="preserve"> paquete Microsoft.AspNetCore.Authentication.JwtBearer 10.0.12 para validar los tokens JWT.</w:t>
+      </w:r>
+    </w:p>
+    <w:p>
+      <w:pPr>
+        <w:pStyle w:val="Prrafodelista"/>
+        <w:numPr>
+          <w:ilvl w:val="0"/>
+          <w:numId w:val="19"/>
+        </w:numPr>
+        <w:spacing w:before="0" w:after="80" w:line="276" w:lineRule="auto"/>
+        <w:ind w:left="720" w:hanging="360"/>
+        <w:jc w:val="left"/>
+      </w:pPr>
+      <w:r>
+        <w:rPr>
+          <w:rFonts w:ascii="Arial" w:hAnsi="Arial" w:cs="Arial"/>
+          <w:b/>
+          <w:bCs/>
+          <w:sz w:val="24"/>
+          <w:szCs w:val="24"/>
+          <w:lang w:val="es-EC"/>
+        </w:rPr>
+        <w:t xml:space="preserve">Frontend:</w:t>
+      </w:r>
+      <w:r>
+        <w:rPr>
+          <w:rFonts w:ascii="Arial" w:hAnsi="Arial" w:cs="Arial"/>
+          <w:sz w:val="24"/>
+          <w:szCs w:val="24"/>
+          <w:lang w:val="es-EC"/>
+        </w:rPr>
+        <w:t xml:space="preserve"> Node.js, npm y Angular 22 (Angular CLI).</w:t>
+      </w:r>
+    </w:p>
+    <w:p>
+      <w:pPr>
+        <w:pStyle w:val="Prrafodelista"/>
+        <w:numPr>
+          <w:ilvl w:val="0"/>
+          <w:numId w:val="19"/>
+        </w:numPr>
+        <w:spacing w:before="0" w:after="80" w:line="276" w:lineRule="auto"/>
+        <w:ind w:left="720" w:hanging="360"/>
+        <w:jc w:val="left"/>
+      </w:pPr>
+      <w:r>
+        <w:rPr>
+          <w:rFonts w:ascii="Arial" w:hAnsi="Arial" w:cs="Arial"/>
+          <w:b/>
+          <w:bCs/>
+          <w:sz w:val="24"/>
+          <w:szCs w:val="24"/>
+          <w:lang w:val="es-EC"/>
+        </w:rPr>
+        <w:t xml:space="preserve">Pruebas:</w:t>
+      </w:r>
+      <w:r>
+        <w:rPr>
+          <w:rFonts w:ascii="Arial" w:hAnsi="Arial" w:cs="Arial"/>
+          <w:sz w:val="24"/>
+          <w:szCs w:val="24"/>
+          <w:lang w:val="es-EC"/>
+        </w:rPr>
+        <w:t xml:space="preserve"> Postman, scripts de PowerShell y el navegador web con sus herramientas de desarrollador (F12).</w:t>
+      </w:r>
+    </w:p>
+    <w:p>
+      <w:pPr>
+        <w:pStyle w:val="Prrafodelista"/>
+        <w:numPr>
+          <w:ilvl w:val="0"/>
+          <w:numId w:val="19"/>
+        </w:numPr>
+        <w:spacing w:before="0" w:after="80" w:line="276" w:lineRule="auto"/>
+        <w:ind w:left="720" w:hanging="360"/>
+        <w:jc w:val="left"/>
+      </w:pPr>
+      <w:r>
+        <w:rPr>
+          <w:rFonts w:ascii="Arial" w:hAnsi="Arial" w:cs="Arial"/>
+          <w:b/>
+          <w:bCs/>
+          <w:sz w:val="24"/>
+          <w:szCs w:val="24"/>
+          <w:lang w:val="es-EC"/>
+        </w:rPr>
+        <w:t xml:space="preserve">Control de versiones:</w:t>
+      </w:r>
+      <w:r>
+        <w:rPr>
+          <w:rFonts w:ascii="Arial" w:hAnsi="Arial" w:cs="Arial"/>
+          <w:sz w:val="24"/>
+          <w:szCs w:val="24"/>
+          <w:lang w:val="es-EC"/>
+        </w:rPr>
+        <w:t xml:space="preserve"> Git y un repositorio público en GitHub.</w:t>
+      </w:r>
+    </w:p>
+    <w:p>
+      <w:pPr>
+        <w:pStyle w:val="Prrafodelista"/>
+        <w:numPr>
+          <w:ilvl w:val="0"/>
+          <w:numId w:val="19"/>
+        </w:numPr>
+        <w:spacing w:before="0" w:after="80" w:line="276" w:lineRule="auto"/>
+        <w:ind w:left="720" w:hanging="360"/>
+        <w:jc w:val="left"/>
+      </w:pPr>
+      <w:r>
+        <w:rPr>
+          <w:rFonts w:ascii="Arial" w:hAnsi="Arial" w:cs="Arial"/>
+          <w:b/>
+          <w:bCs/>
+          <w:sz w:val="24"/>
+          <w:szCs w:val="24"/>
+          <w:lang w:val="es-EC"/>
+        </w:rPr>
+        <w:t xml:space="preserve">Humanos:</w:t>
+      </w:r>
+      <w:r>
+        <w:rPr>
+          <w:rFonts w:ascii="Arial" w:hAnsi="Arial" w:cs="Arial"/>
+          <w:sz w:val="24"/>
+          <w:szCs w:val="24"/>
+          <w:lang w:val="es-EC"/>
+        </w:rPr>
+        <w:t xml:space="preserve"> dos estudiantes desarrolladores y el docente de la asignatura, que guía y revisa los avances.</w:t>
+      </w:r>
+    </w:p>
+    <w:p>
+      <w:pPr>
+        <w:spacing w:after="0"/>
+      </w:pPr>
+    </w:p>
+    <w:p>
+      <w:pPr>
+        <w:pStyle w:val="Prrafodelista"/>
+        <w:numPr>
+          <w:ilvl w:val="0"/>
+          <w:numId w:val="10"/>
+        </w:numPr>
+        <w:jc w:val="both"/>
+        <w:rPr>
+          <w:rFonts w:ascii="Arial" w:hAnsi="Arial" w:cs="Arial"/>
+          <w:b/>
+          <w:sz w:val="24"/>
+          <w:szCs w:val="24"/>
+          <w:lang w:val="es-EC"/>
+        </w:rPr>
+      </w:pPr>
+      <w:r>
+        <w:rPr>
+          <w:rFonts w:ascii="Arial" w:hAnsi="Arial" w:cs="Arial"/>
+          <w:b/>
+          <w:sz w:val="24"/>
+          <w:szCs w:val="24"/>
+          <w:lang w:val="es-EC"/>
+        </w:rPr>
+        <w:t>Desarrollo</w:t>
+      </w:r>
+    </w:p>
+    <w:p>
+      <w:pPr>
+        <w:spacing w:before="0" w:after="160" w:line="276" w:lineRule="auto"/>
+        <w:jc w:val="both"/>
+      </w:pPr>
+      <w:r>
+        <w:rPr>
+          <w:rFonts w:ascii="Arial" w:hAnsi="Arial" w:cs="Arial"/>
+          <w:sz w:val="24"/>
+          <w:szCs w:val="24"/>
+          <w:lang w:val="es-EC"/>
+        </w:rPr>
+        <w:t xml:space="preserve">El trabajo se organizó en fases que siguen el orden de las clases de la asignatura. Cada fase terminó con un commit en GitHub, de modo que el historial del repositorio muestra la evolución del proyecto.</w:t>
+      </w:r>
+    </w:p>
+    <w:p>
+      <w:pPr>
+        <w:keepNext/>
+        <w:spacing w:before="220" w:after="100" w:line="276" w:lineRule="auto"/>
+        <w:jc w:val="left"/>
+      </w:pPr>
+      <w:r>
+        <w:rPr>
+          <w:rFonts w:ascii="Arial" w:hAnsi="Arial" w:cs="Arial"/>
+          <w:b/>
+          <w:bCs/>
+          <w:sz w:val="24"/>
+          <w:szCs w:val="24"/>
+          <w:lang w:val="es-EC"/>
+        </w:rPr>
+        <w:t xml:space="preserve">6.1. Fase 1: Control de versiones y estructura del proyecto</w:t>
+      </w:r>
+    </w:p>
+    <w:p>
+      <w:pPr>
+        <w:spacing w:before="0" w:after="160" w:line="276" w:lineRule="auto"/>
+        <w:jc w:val="both"/>
+      </w:pPr>
+      <w:r>
+        <w:rPr>
+          <w:rFonts w:ascii="Arial" w:hAnsi="Arial" w:cs="Arial"/>
+          <w:sz w:val="24"/>
+          <w:szCs w:val="24"/>
+          <w:lang w:val="es-EC"/>
+        </w:rPr>
+        <w:t xml:space="preserve">Git es un sistema de control de versiones distribuido que guarda el historial de cambios, registra quién hizo cada cambio y permite volver a versiones anteriores (Chacon y Straub, 2014). Se creó un repositorio público en GitHub y se definió una estructura que separa cada parte del sistema:</w:t>
+      </w:r>
+    </w:p>
+    <w:p>
+      <w:pPr>
+        <w:pStyle w:val="Prrafodelista"/>
+        <w:numPr>
+          <w:ilvl w:val="0"/>
+          <w:numId w:val="19"/>
+        </w:numPr>
+        <w:spacing w:before="0" w:after="80" w:line="276" w:lineRule="auto"/>
+        <w:ind w:left="720" w:hanging="360"/>
+        <w:jc w:val="left"/>
+      </w:pPr>
+      <w:r>
+        <w:rPr>
+          <w:rFonts w:ascii="Consolas" w:hAnsi="Consolas" w:cs="Consolas"/>
+          <w:sz w:val="21"/>
+          <w:szCs w:val="21"/>
+          <w:lang w:val="es-EC"/>
+        </w:rPr>
+        <w:t xml:space="preserve">frontend/timebank-web</w:t>
+      </w:r>
+      <w:r>
+        <w:rPr>
+          <w:rFonts w:ascii="Arial" w:hAnsi="Arial" w:cs="Arial"/>
+          <w:sz w:val="24"/>
+          <w:szCs w:val="24"/>
+          <w:lang w:val="es-EC"/>
+        </w:rPr>
+        <w:t xml:space="preserve">: aplicación Angular.</w:t>
+      </w:r>
+    </w:p>
+    <w:p>
+      <w:pPr>
+        <w:pStyle w:val="Prrafodelista"/>
+        <w:numPr>
+          <w:ilvl w:val="0"/>
+          <w:numId w:val="19"/>
+        </w:numPr>
+        <w:spacing w:before="0" w:after="80" w:line="276" w:lineRule="auto"/>
+        <w:ind w:left="720" w:hanging="360"/>
+        <w:jc w:val="left"/>
+      </w:pPr>
+      <w:r>
+        <w:rPr>
+          <w:rFonts w:ascii="Consolas" w:hAnsi="Consolas" w:cs="Consolas"/>
+          <w:sz w:val="21"/>
+          <w:szCs w:val="21"/>
+          <w:lang w:val="es-EC"/>
+        </w:rPr>
+        <w:t xml:space="preserve">backend/TimeBank.API</w:t>
+      </w:r>
+      <w:r>
+        <w:rPr>
+          <w:rFonts w:ascii="Arial" w:hAnsi="Arial" w:cs="Arial"/>
+          <w:sz w:val="24"/>
+          <w:szCs w:val="24"/>
+          <w:lang w:val="es-EC"/>
+        </w:rPr>
+        <w:t xml:space="preserve">: API en ASP.NET Core, organizada en Controllers, Services, Dtos, Models, Data, Security, Extensions y Migrations.</w:t>
+      </w:r>
+    </w:p>
+    <w:p>
+      <w:pPr>
+        <w:pStyle w:val="Prrafodelista"/>
+        <w:numPr>
+          <w:ilvl w:val="0"/>
+          <w:numId w:val="19"/>
+        </w:numPr>
+        <w:spacing w:before="0" w:after="80" w:line="276" w:lineRule="auto"/>
+        <w:ind w:left="720" w:hanging="360"/>
+        <w:jc w:val="left"/>
+      </w:pPr>
+      <w:r>
+        <w:rPr>
           <w:rFonts w:ascii="Consolas" w:hAnsi="Consolas" w:cs="Consolas"/>
           <w:sz w:val="21"/>
           <w:szCs w:val="21"/>
@@ -2072,7 +1646,7 @@
           <w:szCs w:val="20"/>
           <w:lang w:val="es-EC"/>
         </w:rPr>
-        <w:t xml:space="preserve">Tabla 2. </w:t>
+        <w:t xml:space="preserve">Tabla 1. </w:t>
       </w:r>
       <w:r>
         <w:rPr>
@@ -2777,7 +2351,7 @@
           <w:szCs w:val="20"/>
           <w:lang w:val="es-EC"/>
         </w:rPr>
-        <w:t xml:space="preserve">Tabla 3. </w:t>
+        <w:t xml:space="preserve">Tabla 2. </w:t>
       </w:r>
       <w:r>
         <w:rPr>
@@ -4152,7 +3726,7 @@
           <w:szCs w:val="20"/>
           <w:lang w:val="es-EC"/>
         </w:rPr>
-        <w:t xml:space="preserve">Tabla 4. </w:t>
+        <w:t xml:space="preserve">Tabla 3. </w:t>
       </w:r>
       <w:r>
         <w:rPr>
@@ -4996,7 +4570,7 @@
         <w:pStyle w:val="Prrafodelista"/>
         <w:numPr>
           <w:ilvl w:val="0"/>
-          <w:numId w:val="17"/>
+          <w:numId w:val="18"/>
         </w:numPr>
         <w:spacing w:before="0" w:after="100" w:line="276" w:lineRule="auto"/>
         <w:ind w:left="720" w:hanging="360"/>
@@ -5035,7 +4609,7 @@
         <w:pStyle w:val="Prrafodelista"/>
         <w:numPr>
           <w:ilvl w:val="0"/>
-          <w:numId w:val="17"/>
+          <w:numId w:val="18"/>
         </w:numPr>
         <w:spacing w:before="0" w:after="100" w:line="276" w:lineRule="auto"/>
         <w:ind w:left="720" w:hanging="360"/>
@@ -5094,7 +4668,7 @@
         <w:pStyle w:val="Prrafodelista"/>
         <w:numPr>
           <w:ilvl w:val="0"/>
-          <w:numId w:val="17"/>
+          <w:numId w:val="18"/>
         </w:numPr>
         <w:spacing w:before="0" w:after="100" w:line="276" w:lineRule="auto"/>
         <w:ind w:left="720" w:hanging="360"/>
@@ -5171,7 +4745,7 @@
         <w:pStyle w:val="Prrafodelista"/>
         <w:numPr>
           <w:ilvl w:val="0"/>
-          <w:numId w:val="17"/>
+          <w:numId w:val="18"/>
         </w:numPr>
         <w:spacing w:before="0" w:after="100" w:line="276" w:lineRule="auto"/>
         <w:ind w:left="720" w:hanging="360"/>
@@ -5271,7 +4845,7 @@
           <w:szCs w:val="20"/>
           <w:lang w:val="es-EC"/>
         </w:rPr>
-        <w:t xml:space="preserve">Tabla 5. </w:t>
+        <w:t xml:space="preserve">Tabla 4. </w:t>
       </w:r>
       <w:r>
         <w:rPr>
@@ -6125,7 +5699,7 @@
           <w:szCs w:val="20"/>
           <w:lang w:val="es-EC"/>
         </w:rPr>
-        <w:t xml:space="preserve">Tabla 6. </w:t>
+        <w:t xml:space="preserve">Tabla 5. </w:t>
       </w:r>
       <w:r>
         <w:rPr>
@@ -7742,7 +7316,7 @@
           <w:szCs w:val="20"/>
           <w:lang w:val="es-EC"/>
         </w:rPr>
-        <w:t xml:space="preserve">Tabla 7. </w:t>
+        <w:t xml:space="preserve">Tabla 6. </w:t>
       </w:r>
       <w:r>
         <w:rPr>
@@ -8652,7 +8226,7 @@
           <w:szCs w:val="20"/>
           <w:lang w:val="es-EC"/>
         </w:rPr>
-        <w:t xml:space="preserve">Tabla 8. </w:t>
+        <w:t xml:space="preserve">Tabla 7. </w:t>
       </w:r>
       <w:r>
         <w:rPr>
@@ -9131,26 +8705,34 @@
     </w:p>
     <w:p>
       <w:pPr>
+        <w:spacing w:after="0"/>
+      </w:pPr>
+    </w:p>
+    <w:p>
+      <w:pPr>
         <w:pStyle w:val="Prrafodelista"/>
-        <w:keepNext/>
         <w:numPr>
           <w:ilvl w:val="0"/>
           <w:numId w:val="10"/>
         </w:numPr>
-        <w:spacing w:before="280" w:after="140" w:line="276" w:lineRule="auto"/>
-        <w:ind w:left="360" w:hanging="360"/>
-        <w:jc w:val="left"/>
-      </w:pPr>
-      <w:r>
+        <w:jc w:val="both"/>
         <w:rPr>
           <w:rFonts w:ascii="Arial" w:hAnsi="Arial" w:cs="Arial"/>
           <w:b/>
-          <w:bCs/>
-          <w:sz w:val="24"/>
-          <w:szCs w:val="24"/>
-          <w:lang w:val="es-EC"/>
-        </w:rPr>
-        <w:t xml:space="preserve">Conclusiones:</w:t>
+          <w:sz w:val="24"/>
+          <w:szCs w:val="24"/>
+          <w:lang w:val="es-EC"/>
+        </w:rPr>
+      </w:pPr>
+      <w:r>
+        <w:rPr>
+          <w:rFonts w:ascii="Arial" w:hAnsi="Arial" w:cs="Arial"/>
+          <w:b/>
+          <w:sz w:val="24"/>
+          <w:szCs w:val="24"/>
+          <w:lang w:val="es-EC"/>
+        </w:rPr>
+        <w:t>Conclusiones:</w:t>
       </w:r>
     </w:p>
     <w:p>
@@ -9158,7 +8740,7 @@
         <w:pStyle w:val="Prrafodelista"/>
         <w:numPr>
           <w:ilvl w:val="0"/>
-          <w:numId w:val="17"/>
+          <w:numId w:val="1"/>
         </w:numPr>
         <w:spacing w:before="0" w:after="100" w:line="276" w:lineRule="auto"/>
         <w:ind w:left="720" w:hanging="360"/>
@@ -9179,7 +8761,7 @@
         <w:pStyle w:val="Prrafodelista"/>
         <w:numPr>
           <w:ilvl w:val="0"/>
-          <w:numId w:val="17"/>
+          <w:numId w:val="1"/>
         </w:numPr>
         <w:spacing w:before="0" w:after="100" w:line="276" w:lineRule="auto"/>
         <w:ind w:left="720" w:hanging="360"/>
@@ -9200,7 +8782,7 @@
         <w:pStyle w:val="Prrafodelista"/>
         <w:numPr>
           <w:ilvl w:val="0"/>
-          <w:numId w:val="17"/>
+          <w:numId w:val="1"/>
         </w:numPr>
         <w:spacing w:before="0" w:after="100" w:line="276" w:lineRule="auto"/>
         <w:ind w:left="720" w:hanging="360"/>
@@ -9218,26 +8800,34 @@
     </w:p>
     <w:p>
       <w:pPr>
+        <w:spacing w:after="0"/>
+      </w:pPr>
+    </w:p>
+    <w:p>
+      <w:pPr>
         <w:pStyle w:val="Prrafodelista"/>
-        <w:keepNext/>
         <w:numPr>
           <w:ilvl w:val="0"/>
           <w:numId w:val="10"/>
         </w:numPr>
-        <w:spacing w:before="280" w:after="140" w:line="276" w:lineRule="auto"/>
-        <w:ind w:left="360" w:hanging="360"/>
-        <w:jc w:val="left"/>
-      </w:pPr>
-      <w:r>
+        <w:jc w:val="both"/>
         <w:rPr>
           <w:rFonts w:ascii="Arial" w:hAnsi="Arial" w:cs="Arial"/>
           <w:b/>
-          <w:bCs/>
-          <w:sz w:val="24"/>
-          <w:szCs w:val="24"/>
-          <w:lang w:val="es-EC"/>
-        </w:rPr>
-        <w:t xml:space="preserve">Bibliografía:</w:t>
+          <w:sz w:val="24"/>
+          <w:szCs w:val="24"/>
+          <w:lang w:val="es-EC"/>
+        </w:rPr>
+      </w:pPr>
+      <w:r>
+        <w:rPr>
+          <w:rFonts w:ascii="Arial" w:hAnsi="Arial" w:cs="Arial"/>
+          <w:b/>
+          <w:sz w:val="24"/>
+          <w:szCs w:val="24"/>
+          <w:lang w:val="es-EC"/>
+        </w:rPr>
+        <w:t xml:space="preserve">Bibliografía: </w:t>
       </w:r>
     </w:p>
     <w:p>
@@ -9638,26 +9228,44 @@
     </w:p>
     <w:p>
       <w:pPr>
+        <w:spacing w:after="0"/>
+      </w:pPr>
+    </w:p>
+    <w:p>
+      <w:pPr>
         <w:pStyle w:val="Prrafodelista"/>
-        <w:keepNext/>
         <w:numPr>
           <w:ilvl w:val="0"/>
           <w:numId w:val="10"/>
         </w:numPr>
-        <w:spacing w:before="280" w:after="140" w:line="276" w:lineRule="auto"/>
-        <w:ind w:left="360" w:hanging="360"/>
-        <w:jc w:val="left"/>
+        <w:jc w:val="both"/>
+        <w:rPr>
+          <w:rFonts w:ascii="Arial" w:hAnsi="Arial" w:cs="Arial"/>
+          <w:bCs/>
+          <w:sz w:val="24"/>
+          <w:szCs w:val="24"/>
+          <w:lang w:val="es-EC"/>
+        </w:rPr>
       </w:pPr>
       <w:r>
         <w:rPr>
           <w:rFonts w:ascii="Arial" w:hAnsi="Arial" w:cs="Arial"/>
           <w:b/>
+          <w:sz w:val="24"/>
+          <w:szCs w:val="24"/>
+          <w:lang w:val="es-EC"/>
+        </w:rPr>
+        <w:t>Anexos:</w:t>
+      </w:r>
+      <w:r>
+        <w:rPr>
+          <w:rFonts w:ascii="Arial" w:hAnsi="Arial" w:cs="Arial"/>
           <w:bCs/>
           <w:sz w:val="24"/>
           <w:szCs w:val="24"/>
           <w:lang w:val="es-EC"/>
         </w:rPr>
-        <w:t xml:space="preserve">Anexos:</w:t>
+        <w:t xml:space="preserve"> </w:t>
       </w:r>
     </w:p>
     <w:p>
@@ -10003,6 +9611,11 @@
         </w:rPr>
         <w:t xml:space="preserve">Consola del navegador con las categorías recibidas desde la API.</w:t>
       </w:r>
+    </w:p>
+    <w:p>
+      <w:pPr>
+        <w:spacing w:after="0"/>
+      </w:pPr>
     </w:p>
     <w:sectPr>
       <w:headerReference w:type="default" r:id="rId7"/>

</xml_diff>